<commit_message>
refactor: make the enter page more clear, and improve the cv
</commit_message>
<xml_diff>
--- a/public/cv/Chong_Kah_Jun_Full_Stack_Developer_CV.docx
+++ b/public/cv/Chong_Kah_Jun_Full_Stack_Developer_CV.docx
@@ -801,7 +801,7 @@
           <w:between w:space="0" w:sz="0" w:val="nil"/>
         </w:pBdr>
         <w:shd w:fill="auto" w:val="clear"/>
-        <w:spacing w:after="65" w:before="0" w:line="264" w:lineRule="auto"/>
+        <w:spacing w:after="65" w:before="0" w:line="250" w:lineRule="auto"/>
         <w:ind w:left="240" w:right="0" w:hanging="180"/>
         <w:jc w:val="left"/>
         <w:rPr/>
@@ -823,7 +823,7 @@
           <w:vertAlign w:val="baseline"/>
           <w:rtl w:val="0"/>
         </w:rPr>
-        <w:t xml:space="preserve">Built an AI-powered CRM, owning both frontend and backend implementation.</w:t>
+        <w:t xml:space="preserve">Led the initial development of an AI-powered CRM, owning both frontend and backend implementation.</w:t>
       </w:r>
       <w:r>
         <w:rPr>
@@ -849,7 +849,7 @@
           <w:between w:space="0" w:sz="0" w:val="nil"/>
         </w:pBdr>
         <w:shd w:fill="auto" w:val="clear"/>
-        <w:spacing w:after="65" w:before="0" w:line="264" w:lineRule="auto"/>
+        <w:spacing w:after="65" w:before="0" w:line="250" w:lineRule="auto"/>
         <w:ind w:left="240" w:right="0" w:hanging="180"/>
         <w:jc w:val="left"/>
         <w:rPr/>
@@ -871,7 +871,7 @@
           <w:vertAlign w:val="baseline"/>
           <w:rtl w:val="0"/>
         </w:rPr>
-        <w:t xml:space="preserve">Enabled each department to build its own AI knowledge base, using RAG with Pinecone for relevant question answering.</w:t>
+        <w:t xml:space="preserve">Established core architecture, reusable components, and integrations for scalability and future development.</w:t>
       </w:r>
       <w:r>
         <w:rPr>
@@ -897,7 +897,7 @@
           <w:between w:space="0" w:sz="0" w:val="nil"/>
         </w:pBdr>
         <w:shd w:fill="auto" w:val="clear"/>
-        <w:spacing w:after="65" w:before="0" w:line="264" w:lineRule="auto"/>
+        <w:spacing w:after="65" w:before="0" w:line="250" w:lineRule="auto"/>
         <w:ind w:left="240" w:right="0" w:hanging="180"/>
         <w:jc w:val="left"/>
         <w:rPr/>
@@ -919,7 +919,103 @@
           <w:vertAlign w:val="baseline"/>
           <w:rtl w:val="0"/>
         </w:rPr>
-        <w:t xml:space="preserve">Worked across Next.js, TypeScript, Express, Python, MongoDB, and AI SDKs.</w:t>
+        <w:t xml:space="preserve">Built initial RAG and Pinecone infrastructure for department-specific AI knowledge bases.</w:t>
+      </w:r>
+      <w:r>
+        <w:rPr>
+          <w:rtl w:val="0"/>
+        </w:rPr>
+      </w:r>
+    </w:p>
+    <w:p>
+      <w:pPr>
+        <w:keepNext w:val="0"/>
+        <w:keepLines w:val="1"/>
+        <w:pageBreakBefore w:val="0"/>
+        <w:widowControl w:val="1"/>
+        <w:numPr>
+          <w:ilvl w:val="0"/>
+          <w:numId w:val="1"/>
+        </w:numPr>
+        <w:pBdr>
+          <w:top w:space="0" w:sz="0" w:val="nil"/>
+          <w:left w:space="0" w:sz="0" w:val="nil"/>
+          <w:bottom w:space="0" w:sz="0" w:val="nil"/>
+          <w:right w:space="0" w:sz="0" w:val="nil"/>
+          <w:between w:space="0" w:sz="0" w:val="nil"/>
+        </w:pBdr>
+        <w:shd w:fill="auto" w:val="clear"/>
+        <w:spacing w:after="65" w:before="0" w:line="250" w:lineRule="auto"/>
+        <w:ind w:left="240" w:right="0" w:hanging="180"/>
+        <w:jc w:val="left"/>
+        <w:rPr/>
+      </w:pPr>
+      <w:r>
+        <w:rPr>
+          <w:rFonts w:ascii="Arial" w:cs="Arial" w:eastAsia="Arial" w:hAnsi="Arial"/>
+          <w:b w:val="0"/>
+          <w:bCs w:val="0"/>
+          <w:i w:val="0"/>
+          <w:iCs w:val="0"/>
+          <w:smallCaps w:val="0"/>
+          <w:strike w:val="0"/>
+          <w:color w:val="17212b"/>
+          <w:sz w:val="21"/>
+          <w:szCs w:val="21"/>
+          <w:u w:val="none"/>
+          <w:shd w:fill="auto" w:val="clear"/>
+          <w:vertAlign w:val="baseline"/>
+          <w:rtl w:val="0"/>
+        </w:rPr>
+        <w:t xml:space="preserve">Created technical documentation and development guidelines to support team collaboration, developer onboarding, and long-term maintainability.</w:t>
+      </w:r>
+      <w:r>
+        <w:rPr>
+          <w:rtl w:val="0"/>
+        </w:rPr>
+      </w:r>
+    </w:p>
+    <w:p>
+      <w:pPr>
+        <w:keepNext w:val="0"/>
+        <w:keepLines w:val="1"/>
+        <w:pageBreakBefore w:val="0"/>
+        <w:widowControl w:val="1"/>
+        <w:numPr>
+          <w:ilvl w:val="0"/>
+          <w:numId w:val="1"/>
+        </w:numPr>
+        <w:pBdr>
+          <w:top w:space="0" w:sz="0" w:val="nil"/>
+          <w:left w:space="0" w:sz="0" w:val="nil"/>
+          <w:bottom w:space="0" w:sz="0" w:val="nil"/>
+          <w:right w:space="0" w:sz="0" w:val="nil"/>
+          <w:between w:space="0" w:sz="0" w:val="nil"/>
+        </w:pBdr>
+        <w:shd w:fill="auto" w:val="clear"/>
+        <w:spacing w:after="65" w:before="0" w:line="250" w:lineRule="auto"/>
+        <w:ind w:left="240" w:right="0" w:hanging="180"/>
+        <w:jc w:val="left"/>
+        <w:rPr/>
+      </w:pPr>
+      <w:r>
+        <w:rPr>
+          <w:rFonts w:ascii="Arial" w:cs="Arial" w:eastAsia="Arial" w:hAnsi="Arial"/>
+          <w:b w:val="0"/>
+          <w:bCs w:val="0"/>
+          <w:i w:val="0"/>
+          <w:iCs w:val="0"/>
+          <w:smallCaps w:val="0"/>
+          <w:strike w:val="0"/>
+          <w:color w:val="17212b"/>
+          <w:sz w:val="21"/>
+          <w:szCs w:val="21"/>
+          <w:u w:val="none"/>
+          <w:shd w:fill="auto" w:val="clear"/>
+          <w:vertAlign w:val="baseline"/>
+          <w:rtl w:val="0"/>
+        </w:rPr>
+        <w:t xml:space="preserve">Tech stack: Next.js, TypeScript, Express, Python, MongoDB, Pinecone, and AI SDKs.</w:t>
       </w:r>
       <w:r>
         <w:rPr>

</xml_diff>

<commit_message>
chore: remove the nickname
</commit_message>
<xml_diff>
--- a/public/cv/Chong_Kah_Jun_Full_Stack_Developer_CV.docx
+++ b/public/cv/Chong_Kah_Jun_Full_Stack_Developer_CV.docx
@@ -65,7 +65,7 @@
           <w:szCs w:val="48"/>
           <w:rtl w:val="0"/>
         </w:rPr>
-        <w:t xml:space="preserve">CHONG KAH JUN (DAMIEN)</w:t>
+        <w:t xml:space="preserve">CHONG KAH JUN</w:t>
       </w:r>
       <w:r>
         <w:rPr>
@@ -1237,7 +1237,7 @@
           <w:szCs w:val="20"/>
           <w:rtl w:val="0"/>
         </w:rPr>
-        <w:t xml:space="preserve">CHONG KAH JUN (DAMIEN)</w:t>
+        <w:t xml:space="preserve">CHONG KAH JUN</w:t>
       </w:r>
       <w:r>
         <w:rPr>

</xml_diff>

<commit_message>
refactor: change the anomaly detection github description and link
</commit_message>
<xml_diff>
--- a/public/cv/Chong_Kah_Jun_Full_Stack_Developer_CV.docx
+++ b/public/cv/Chong_Kah_Jun_Full_Stack_Developer_CV.docx
@@ -1966,7 +1966,7 @@
           <w:szCs w:val="22"/>
           <w:rtl w:val="0"/>
         </w:rPr>
-        <w:t xml:space="preserve">Hybrid Anomaly Detection for Microservice Observability: </w:t>
+        <w:t xml:space="preserve">System Anomaly Detection: </w:t>
       </w:r>
       <w:r>
         <w:rPr>
@@ -2044,7 +2044,7 @@
           <w:vertAlign w:val="baseline"/>
           <w:rtl w:val="0"/>
         </w:rPr>
-        <w:t xml:space="preserve">Investigated hybrid anomaly detection for application telemetry, combining metrics and trace ingestion, stream processing, ML inference, and a live observability dashboard.</w:t>
+        <w:t xml:space="preserve">Combined Go telemetry ingestion, Redis streaming, Python ML, a React dashboard, and load/chaos tooling in an end-to-end hybrid anomaly-detection system.</w:t>
       </w:r>
       <w:r>
         <w:rPr>

</xml_diff>